<commit_message>
new courses added and synced some courses up to date
</commit_message>
<xml_diff>
--- a/ECO7101/NTM/Assignments/CoverPage_Eco7101_Assignment_01.docx
+++ b/ECO7101/NTM/Assignments/CoverPage_Eco7101_Assignment_01.docx
@@ -35,16 +35,205 @@
         <mc:AlternateContent>
           <mc:Choice Requires="wps">
             <w:drawing>
-              <wp:anchor distT="0" distB="0" distL="114300" distR="114300" simplePos="0" relativeHeight="251688448" behindDoc="0" locked="0" layoutInCell="1" allowOverlap="1" wp14:anchorId="0BECBFBF" wp14:editId="3E08270B">
+              <wp:anchor distT="0" distB="0" distL="114300" distR="114300" simplePos="0" relativeHeight="251654656" behindDoc="0" locked="0" layoutInCell="1" allowOverlap="1" wp14:anchorId="57549032" wp14:editId="10BC785C">
                 <wp:simplePos x="0" y="0"/>
                 <wp:positionH relativeFrom="column">
-                  <wp:posOffset>870626</wp:posOffset>
+                  <wp:posOffset>1133475</wp:posOffset>
                 </wp:positionH>
                 <wp:positionV relativeFrom="paragraph">
-                  <wp:posOffset>2709896</wp:posOffset>
+                  <wp:posOffset>2586990</wp:posOffset>
                 </wp:positionV>
-                <wp:extent cx="5749046" cy="1384300"/>
-                <wp:effectExtent l="0" t="0" r="4445" b="6350"/>
+                <wp:extent cx="2552700" cy="307975"/>
+                <wp:effectExtent l="0" t="0" r="0" b="0"/>
+                <wp:wrapNone/>
+                <wp:docPr id="281153237" name="Text Box 7"/>
+                <wp:cNvGraphicFramePr/>
+                <a:graphic xmlns:a="http://schemas.openxmlformats.org/drawingml/2006/main">
+                  <a:graphicData uri="http://schemas.microsoft.com/office/word/2010/wordprocessingShape">
+                    <wps:wsp>
+                      <wps:cNvSpPr txBox="1"/>
+                      <wps:spPr>
+                        <a:xfrm>
+                          <a:off x="0" y="0"/>
+                          <a:ext cx="2552700" cy="307975"/>
+                        </a:xfrm>
+                        <a:prstGeom prst="rect">
+                          <a:avLst/>
+                        </a:prstGeom>
+                        <a:solidFill>
+                          <a:schemeClr val="lt1"/>
+                        </a:solidFill>
+                        <a:ln w="6350">
+                          <a:noFill/>
+                        </a:ln>
+                      </wps:spPr>
+                      <wps:txbx>
+                        <w:txbxContent>
+                          <w:p>
+                            <w:pPr>
+                              <w:rPr>
+                                <w:rFonts w:ascii="Gill Sans MT" w:hAnsi="Gill Sans MT"/>
+                                <w:b/>
+                                <w:bCs/>
+                                <w:sz w:val="28"/>
+                                <w:szCs w:val="28"/>
+                              </w:rPr>
+                            </w:pPr>
+                            <w:r>
+                              <w:rPr>
+                                <w:rFonts w:ascii="Gill Sans MT" w:hAnsi="Gill Sans MT"/>
+                                <w:b/>
+                                <w:bCs/>
+                                <w:sz w:val="28"/>
+                                <w:szCs w:val="28"/>
+                              </w:rPr>
+                              <w:t>COURSE INFORMATION</w:t>
+                            </w:r>
+                          </w:p>
+                        </w:txbxContent>
+                      </wps:txbx>
+                      <wps:bodyPr rot="0" spcFirstLastPara="0" vertOverflow="overflow" horzOverflow="overflow" vert="horz" wrap="square" lIns="91440" tIns="45720" rIns="91440" bIns="45720" numCol="1" spcCol="0" rtlCol="0" fromWordArt="0" anchor="t" anchorCtr="0" forceAA="0" compatLnSpc="1">
+                        <a:prstTxWarp prst="textNoShape">
+                          <a:avLst/>
+                        </a:prstTxWarp>
+                        <a:noAutofit/>
+                      </wps:bodyPr>
+                    </wps:wsp>
+                  </a:graphicData>
+                </a:graphic>
+                <wp14:sizeRelH relativeFrom="margin">
+                  <wp14:pctWidth>0</wp14:pctWidth>
+                </wp14:sizeRelH>
+                <wp14:sizeRelV relativeFrom="margin">
+                  <wp14:pctHeight>0</wp14:pctHeight>
+                </wp14:sizeRelV>
+              </wp:anchor>
+            </w:drawing>
+          </mc:Choice>
+          <mc:Fallback>
+            <w:pict>
+              <v:shapetype w14:anchorId="57549032" id="_x0000_t202" coordsize="21600,21600" o:spt="202" path="m,l,21600r21600,l21600,xe">
+                <v:stroke joinstyle="miter"/>
+                <v:path gradientshapeok="t" o:connecttype="rect"/>
+              </v:shapetype>
+              <v:shape id="Text Box 7" o:spid="_x0000_s1026" type="#_x0000_t202" style="position:absolute;margin-left:89.25pt;margin-top:203.7pt;width:201pt;height:24.25pt;z-index:251654656;visibility:visible;mso-wrap-style:square;mso-width-percent:0;mso-height-percent:0;mso-wrap-distance-left:9pt;mso-wrap-distance-top:0;mso-wrap-distance-right:9pt;mso-wrap-distance-bottom:0;mso-position-horizontal:absolute;mso-position-horizontal-relative:text;mso-position-vertical:absolute;mso-position-vertical-relative:text;mso-width-percent:0;mso-height-percent:0;mso-width-relative:margin;mso-height-relative:margin;v-text-anchor:top" o:gfxdata="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" fillcolor="white [3201]" stroked="f" strokeweight=".5pt">
+                <v:textbox>
+                  <w:txbxContent>
+                    <w:p>
+                      <w:pPr>
+                        <w:rPr>
+                          <w:rFonts w:ascii="Gill Sans MT" w:hAnsi="Gill Sans MT"/>
+                          <w:b/>
+                          <w:bCs/>
+                          <w:sz w:val="28"/>
+                          <w:szCs w:val="28"/>
+                        </w:rPr>
+                      </w:pPr>
+                      <w:r>
+                        <w:rPr>
+                          <w:rFonts w:ascii="Gill Sans MT" w:hAnsi="Gill Sans MT"/>
+                          <w:b/>
+                          <w:bCs/>
+                          <w:sz w:val="28"/>
+                          <w:szCs w:val="28"/>
+                        </w:rPr>
+                        <w:t>COURSE INFORMATION</w:t>
+                      </w:r>
+                    </w:p>
+                  </w:txbxContent>
+                </v:textbox>
+              </v:shape>
+            </w:pict>
+          </mc:Fallback>
+        </mc:AlternateContent>
+      </w:r>
+      <w:r>
+        <w:rPr>
+          <w:b/>
+          <w:bCs/>
+          <w:noProof/>
+          <w:color w:val="000000" w:themeColor="text1"/>
+          <w:sz w:val="52"/>
+          <w:szCs w:val="52"/>
+        </w:rPr>
+        <w:drawing>
+          <wp:anchor distT="0" distB="0" distL="114300" distR="114300" simplePos="0" relativeHeight="251608576" behindDoc="0" locked="0" layoutInCell="1" allowOverlap="1" wp14:anchorId="03DE9CF3" wp14:editId="0A265B47">
+            <wp:simplePos x="0" y="0"/>
+            <wp:positionH relativeFrom="margin">
+              <wp:posOffset>819409</wp:posOffset>
+            </wp:positionH>
+            <wp:positionV relativeFrom="paragraph">
+              <wp:posOffset>2578515</wp:posOffset>
+            </wp:positionV>
+            <wp:extent cx="316865" cy="316865"/>
+            <wp:effectExtent l="0" t="0" r="6985" b="6985"/>
+            <wp:wrapSquare wrapText="bothSides"/>
+            <wp:docPr id="727120208" name="Graphic 6" descr="Postit Notes 3 with solid fill"/>
+            <wp:cNvGraphicFramePr>
+              <a:graphicFrameLocks xmlns:a="http://schemas.openxmlformats.org/drawingml/2006/main" noChangeAspect="1"/>
+            </wp:cNvGraphicFramePr>
+            <a:graphic xmlns:a="http://schemas.openxmlformats.org/drawingml/2006/main">
+              <a:graphicData uri="http://schemas.openxmlformats.org/drawingml/2006/picture">
+                <pic:pic xmlns:pic="http://schemas.openxmlformats.org/drawingml/2006/picture">
+                  <pic:nvPicPr>
+                    <pic:cNvPr id="727120208" name="Graphic 727120208" descr="Postit Notes 3 with solid fill"/>
+                    <pic:cNvPicPr/>
+                  </pic:nvPicPr>
+                  <pic:blipFill>
+                    <a:blip r:embed="rId11">
+                      <a:extLst>
+                        <a:ext uri="{96DAC541-7B7A-43D3-8B79-37D633B846F1}">
+                          <asvg:svgBlip xmlns:asvg="http://schemas.microsoft.com/office/drawing/2016/SVG/main" r:embed="rId12"/>
+                        </a:ext>
+                      </a:extLst>
+                    </a:blip>
+                    <a:stretch>
+                      <a:fillRect/>
+                    </a:stretch>
+                  </pic:blipFill>
+                  <pic:spPr>
+                    <a:xfrm>
+                      <a:off x="0" y="0"/>
+                      <a:ext cx="316865" cy="316865"/>
+                    </a:xfrm>
+                    <a:prstGeom prst="rect">
+                      <a:avLst/>
+                    </a:prstGeom>
+                  </pic:spPr>
+                </pic:pic>
+              </a:graphicData>
+            </a:graphic>
+            <wp14:sizeRelH relativeFrom="margin">
+              <wp14:pctWidth>0</wp14:pctWidth>
+            </wp14:sizeRelH>
+            <wp14:sizeRelV relativeFrom="margin">
+              <wp14:pctHeight>0</wp14:pctHeight>
+            </wp14:sizeRelV>
+          </wp:anchor>
+        </w:drawing>
+      </w:r>
+      <w:r>
+        <w:rPr>
+          <w:b/>
+          <w:bCs/>
+          <w:noProof/>
+          <w:color w:val="000000" w:themeColor="text1"/>
+          <w:sz w:val="52"/>
+          <w:szCs w:val="52"/>
+        </w:rPr>
+        <mc:AlternateContent>
+          <mc:Choice Requires="wps">
+            <w:drawing>
+              <wp:anchor distT="0" distB="0" distL="114300" distR="114300" simplePos="0" relativeHeight="251688448" behindDoc="0" locked="0" layoutInCell="1" allowOverlap="1" wp14:anchorId="0BECBFBF" wp14:editId="53159DC6">
+                <wp:simplePos x="0" y="0"/>
+                <wp:positionH relativeFrom="column">
+                  <wp:posOffset>876741</wp:posOffset>
+                </wp:positionH>
+                <wp:positionV relativeFrom="paragraph">
+                  <wp:posOffset>3023610</wp:posOffset>
+                </wp:positionV>
+                <wp:extent cx="5749046" cy="802433"/>
+                <wp:effectExtent l="0" t="0" r="4445" b="0"/>
                 <wp:wrapNone/>
                 <wp:docPr id="868807877" name="Text Box 8"/>
                 <wp:cNvGraphicFramePr/>
@@ -55,7 +244,7 @@
                       <wps:spPr>
                         <a:xfrm>
                           <a:off x="0" y="0"/>
-                          <a:ext cx="5749046" cy="1384300"/>
+                          <a:ext cx="5749046" cy="802433"/>
                         </a:xfrm>
                         <a:prstGeom prst="rect">
                           <a:avLst/>
@@ -97,7 +286,15 @@
                                 <w:b/>
                                 <w:bCs/>
                               </w:rPr>
-                              <w:t xml:space="preserve"> ECO7101</w:t>
+                              <w:t xml:space="preserve"> </w:t>
+                            </w:r>
+                            <w:r>
+                              <w:rPr>
+                                <w:rFonts w:ascii="Gill Sans MT" w:hAnsi="Gill Sans MT"/>
+                                <w:b/>
+                                <w:bCs/>
+                              </w:rPr>
+                              <w:t>STA102</w:t>
                             </w:r>
                           </w:p>
                           <w:p>
@@ -136,46 +333,7 @@
                                 <w:b/>
                                 <w:bCs/>
                               </w:rPr>
-                              <w:t>Principles of Microeconomics</w:t>
-                            </w:r>
-                          </w:p>
-                          <w:p>
-                            <w:pPr>
-                              <w:pStyle w:val="ListParagraph"/>
-                              <w:numPr>
-                                <w:ilvl w:val="0"/>
-                                <w:numId w:val="6"/>
-                              </w:numPr>
-                              <w:spacing w:line="480" w:lineRule="auto"/>
-                              <w:rPr>
-                                <w:rFonts w:ascii="Gill Sans MT" w:hAnsi="Gill Sans MT"/>
-                                <w:b/>
-                                <w:bCs/>
-                              </w:rPr>
-                            </w:pPr>
-                            <w:r>
-                              <w:rPr>
-                                <w:rFonts w:ascii="Gill Sans MT" w:hAnsi="Gill Sans MT"/>
-                                <w:b/>
-                                <w:bCs/>
-                              </w:rPr>
-                              <w:t>Topic</w:t>
-                            </w:r>
-                            <w:r>
-                              <w:rPr>
-                                <w:rFonts w:ascii="Gill Sans MT" w:hAnsi="Gill Sans MT"/>
-                                <w:b/>
-                                <w:bCs/>
-                              </w:rPr>
-                              <w:t>:</w:t>
-                            </w:r>
-                            <w:r>
-                              <w:rPr>
-                                <w:rFonts w:ascii="Gill Sans MT" w:hAnsi="Gill Sans MT"/>
-                                <w:b/>
-                                <w:bCs/>
-                              </w:rPr>
-                              <w:t xml:space="preserve"> PPF, Demand &amp; Supply, Opportunity Cost, Elasticity</w:t>
+                              <w:t>Statistics and Probability</w:t>
                             </w:r>
                           </w:p>
                         </w:txbxContent>
@@ -204,7 +362,7 @@
                 <v:stroke joinstyle="miter"/>
                 <v:path gradientshapeok="t" o:connecttype="rect"/>
               </v:shapetype>
-              <v:shape id="Text Box 8" o:spid="_x0000_s1026" type="#_x0000_t202" style="position:absolute;margin-left:68.55pt;margin-top:213.4pt;width:452.7pt;height:109pt;z-index:251688448;visibility:visible;mso-wrap-style:square;mso-width-percent:0;mso-height-percent:0;mso-wrap-distance-left:9pt;mso-wrap-distance-top:0;mso-wrap-distance-right:9pt;mso-wrap-distance-bottom:0;mso-position-horizontal:absolute;mso-position-horizontal-relative:text;mso-position-vertical:absolute;mso-position-vertical-relative:text;mso-width-percent:0;mso-height-percent:0;mso-width-relative:margin;mso-height-relative:margin;v-text-anchor:top" o:gfxdata="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" fillcolor="white [3201]" stroked="f" strokeweight=".5pt">
+              <v:shape id="Text Box 8" o:spid="_x0000_s1027" type="#_x0000_t202" style="position:absolute;margin-left:69.05pt;margin-top:238.1pt;width:452.7pt;height:63.2pt;z-index:251688448;visibility:visible;mso-wrap-style:square;mso-width-percent:0;mso-height-percent:0;mso-wrap-distance-left:9pt;mso-wrap-distance-top:0;mso-wrap-distance-right:9pt;mso-wrap-distance-bottom:0;mso-position-horizontal:absolute;mso-position-horizontal-relative:text;mso-position-vertical:absolute;mso-position-vertical-relative:text;mso-width-percent:0;mso-height-percent:0;mso-width-relative:margin;mso-height-relative:margin;v-text-anchor:top" o:gfxdata="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" fillcolor="white [3201]" stroked="f" strokeweight=".5pt">
                 <v:textbox>
                   <w:txbxContent>
                     <w:p>
@@ -235,7 +393,15 @@
                           <w:b/>
                           <w:bCs/>
                         </w:rPr>
-                        <w:t xml:space="preserve"> ECO7101</w:t>
+                        <w:t xml:space="preserve"> </w:t>
+                      </w:r>
+                      <w:r>
+                        <w:rPr>
+                          <w:rFonts w:ascii="Gill Sans MT" w:hAnsi="Gill Sans MT"/>
+                          <w:b/>
+                          <w:bCs/>
+                        </w:rPr>
+                        <w:t>STA102</w:t>
                       </w:r>
                     </w:p>
                     <w:p>
@@ -274,46 +440,7 @@
                           <w:b/>
                           <w:bCs/>
                         </w:rPr>
-                        <w:t>Principles of Microeconomics</w:t>
-                      </w:r>
-                    </w:p>
-                    <w:p>
-                      <w:pPr>
-                        <w:pStyle w:val="ListParagraph"/>
-                        <w:numPr>
-                          <w:ilvl w:val="0"/>
-                          <w:numId w:val="6"/>
-                        </w:numPr>
-                        <w:spacing w:line="480" w:lineRule="auto"/>
-                        <w:rPr>
-                          <w:rFonts w:ascii="Gill Sans MT" w:hAnsi="Gill Sans MT"/>
-                          <w:b/>
-                          <w:bCs/>
-                        </w:rPr>
-                      </w:pPr>
-                      <w:r>
-                        <w:rPr>
-                          <w:rFonts w:ascii="Gill Sans MT" w:hAnsi="Gill Sans MT"/>
-                          <w:b/>
-                          <w:bCs/>
-                        </w:rPr>
-                        <w:t>Topic</w:t>
-                      </w:r>
-                      <w:r>
-                        <w:rPr>
-                          <w:rFonts w:ascii="Gill Sans MT" w:hAnsi="Gill Sans MT"/>
-                          <w:b/>
-                          <w:bCs/>
-                        </w:rPr>
-                        <w:t>:</w:t>
-                      </w:r>
-                      <w:r>
-                        <w:rPr>
-                          <w:rFonts w:ascii="Gill Sans MT" w:hAnsi="Gill Sans MT"/>
-                          <w:b/>
-                          <w:bCs/>
-                        </w:rPr>
-                        <w:t xml:space="preserve"> PPF, Demand &amp; Supply, Opportunity Cost, Elasticity</w:t>
+                        <w:t>Statistics and Probability</w:t>
                       </w:r>
                     </w:p>
                   </w:txbxContent>
@@ -333,7 +460,7 @@
           <w:szCs w:val="52"/>
         </w:rPr>
         <w:drawing>
-          <wp:anchor distT="0" distB="0" distL="114300" distR="114300" simplePos="0" relativeHeight="251806208" behindDoc="0" locked="0" layoutInCell="1" allowOverlap="0" wp14:anchorId="31119DF5" wp14:editId="639A0239">
+          <wp:anchor distT="0" distB="0" distL="114300" distR="114300" simplePos="0" relativeHeight="251806208" behindDoc="0" locked="0" layoutInCell="1" allowOverlap="0" wp14:anchorId="31119DF5" wp14:editId="64E640A9">
             <wp:simplePos x="0" y="0"/>
             <wp:positionH relativeFrom="margin">
               <wp:posOffset>2937510</wp:posOffset>
@@ -370,7 +497,7 @@
                     <pic:cNvPicPr/>
                   </pic:nvPicPr>
                   <pic:blipFill>
-                    <a:blip r:embed="rId11" cstate="print">
+                    <a:blip r:embed="rId13" cstate="print">
                       <a:extLst>
                         <a:ext uri="{28A0092B-C50C-407E-A947-70E740481C1C}">
                           <a14:useLocalDpi xmlns:a14="http://schemas.microsoft.com/office/drawing/2010/main" val="0"/>
@@ -414,7 +541,7 @@
         <mc:AlternateContent>
           <mc:Choice Requires="wps">
             <w:drawing>
-              <wp:anchor distT="0" distB="0" distL="114300" distR="114300" simplePos="0" relativeHeight="251570688" behindDoc="0" locked="0" layoutInCell="1" allowOverlap="1" wp14:anchorId="4B68CF41" wp14:editId="58CC400C">
+              <wp:anchor distT="0" distB="0" distL="114300" distR="114300" simplePos="0" relativeHeight="251570688" behindDoc="0" locked="0" layoutInCell="1" allowOverlap="1" wp14:anchorId="4B68CF41" wp14:editId="704B879B">
                 <wp:simplePos x="0" y="0"/>
                 <wp:positionH relativeFrom="margin">
                   <wp:align>center</wp:align>
@@ -518,7 +645,7 @@
           </mc:Choice>
           <mc:Fallback>
             <w:pict>
-              <v:shape w14:anchorId="4B68CF41" id="Text Box 5" o:spid="_x0000_s1027" type="#_x0000_t202" style="position:absolute;margin-left:0;margin-top:125.75pt;width:290.15pt;height:40.8pt;z-index:251570688;visibility:visible;mso-wrap-style:square;mso-width-percent:0;mso-height-percent:0;mso-wrap-distance-left:9pt;mso-wrap-distance-top:0;mso-wrap-distance-right:9pt;mso-wrap-distance-bottom:0;mso-position-horizontal:center;mso-position-horizontal-relative:margin;mso-position-vertical:absolute;mso-position-vertical-relative:text;mso-width-percent:0;mso-height-percent:0;mso-width-relative:margin;mso-height-relative:margin;v-text-anchor:top" o:gfxdata="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" fillcolor="white [3201]" stroked="f" strokeweight=".5pt">
+              <v:shape w14:anchorId="4B68CF41" id="Text Box 5" o:spid="_x0000_s1028" type="#_x0000_t202" style="position:absolute;margin-left:0;margin-top:125.75pt;width:290.15pt;height:40.8pt;z-index:251570688;visibility:visible;mso-wrap-style:square;mso-width-percent:0;mso-height-percent:0;mso-wrap-distance-left:9pt;mso-wrap-distance-top:0;mso-wrap-distance-right:9pt;mso-wrap-distance-bottom:0;mso-position-horizontal:center;mso-position-horizontal-relative:margin;mso-position-vertical:absolute;mso-position-vertical-relative:text;mso-width-percent:0;mso-height-percent:0;mso-width-relative:margin;mso-height-relative:margin;v-text-anchor:top" o:gfxdata="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" fillcolor="white [3201]" stroked="f" strokeweight=".5pt">
                 <v:textbox>
                   <w:txbxContent>
                     <w:p>
@@ -576,191 +703,6 @@
             </w:pict>
           </mc:Fallback>
         </mc:AlternateContent>
-      </w:r>
-      <w:r>
-        <w:rPr>
-          <w:b/>
-          <w:bCs/>
-          <w:noProof/>
-          <w:color w:val="000000" w:themeColor="text1"/>
-          <w:sz w:val="52"/>
-          <w:szCs w:val="52"/>
-        </w:rPr>
-        <mc:AlternateContent>
-          <mc:Choice Requires="wps">
-            <w:drawing>
-              <wp:anchor distT="0" distB="0" distL="114300" distR="114300" simplePos="0" relativeHeight="251654656" behindDoc="0" locked="0" layoutInCell="1" allowOverlap="1" wp14:anchorId="57549032" wp14:editId="28014C63">
-                <wp:simplePos x="0" y="0"/>
-                <wp:positionH relativeFrom="column">
-                  <wp:posOffset>1143011</wp:posOffset>
-                </wp:positionH>
-                <wp:positionV relativeFrom="paragraph">
-                  <wp:posOffset>2363470</wp:posOffset>
-                </wp:positionV>
-                <wp:extent cx="2553059" cy="307975"/>
-                <wp:effectExtent l="0" t="0" r="0" b="0"/>
-                <wp:wrapNone/>
-                <wp:docPr id="281153237" name="Text Box 7"/>
-                <wp:cNvGraphicFramePr/>
-                <a:graphic xmlns:a="http://schemas.openxmlformats.org/drawingml/2006/main">
-                  <a:graphicData uri="http://schemas.microsoft.com/office/word/2010/wordprocessingShape">
-                    <wps:wsp>
-                      <wps:cNvSpPr txBox="1"/>
-                      <wps:spPr>
-                        <a:xfrm>
-                          <a:off x="0" y="0"/>
-                          <a:ext cx="2553059" cy="307975"/>
-                        </a:xfrm>
-                        <a:prstGeom prst="rect">
-                          <a:avLst/>
-                        </a:prstGeom>
-                        <a:solidFill>
-                          <a:schemeClr val="lt1"/>
-                        </a:solidFill>
-                        <a:ln w="6350">
-                          <a:noFill/>
-                        </a:ln>
-                      </wps:spPr>
-                      <wps:txbx>
-                        <w:txbxContent>
-                          <w:p>
-                            <w:pPr>
-                              <w:rPr>
-                                <w:rFonts w:ascii="Gill Sans MT" w:hAnsi="Gill Sans MT"/>
-                                <w:b/>
-                                <w:bCs/>
-                                <w:sz w:val="28"/>
-                                <w:szCs w:val="28"/>
-                              </w:rPr>
-                            </w:pPr>
-                            <w:r>
-                              <w:rPr>
-                                <w:rFonts w:ascii="Gill Sans MT" w:hAnsi="Gill Sans MT"/>
-                                <w:b/>
-                                <w:bCs/>
-                                <w:sz w:val="28"/>
-                                <w:szCs w:val="28"/>
-                              </w:rPr>
-                              <w:t>COURSE INFORMATION</w:t>
-                            </w:r>
-                          </w:p>
-                        </w:txbxContent>
-                      </wps:txbx>
-                      <wps:bodyPr rot="0" spcFirstLastPara="0" vertOverflow="overflow" horzOverflow="overflow" vert="horz" wrap="square" lIns="91440" tIns="45720" rIns="91440" bIns="45720" numCol="1" spcCol="0" rtlCol="0" fromWordArt="0" anchor="t" anchorCtr="0" forceAA="0" compatLnSpc="1">
-                        <a:prstTxWarp prst="textNoShape">
-                          <a:avLst/>
-                        </a:prstTxWarp>
-                        <a:noAutofit/>
-                      </wps:bodyPr>
-                    </wps:wsp>
-                  </a:graphicData>
-                </a:graphic>
-                <wp14:sizeRelH relativeFrom="margin">
-                  <wp14:pctWidth>0</wp14:pctWidth>
-                </wp14:sizeRelH>
-                <wp14:sizeRelV relativeFrom="margin">
-                  <wp14:pctHeight>0</wp14:pctHeight>
-                </wp14:sizeRelV>
-              </wp:anchor>
-            </w:drawing>
-          </mc:Choice>
-          <mc:Fallback>
-            <w:pict>
-              <v:shape w14:anchorId="57549032" id="Text Box 7" o:spid="_x0000_s1028" type="#_x0000_t202" style="position:absolute;margin-left:90pt;margin-top:186.1pt;width:201.05pt;height:24.25pt;z-index:251654656;visibility:visible;mso-wrap-style:square;mso-width-percent:0;mso-height-percent:0;mso-wrap-distance-left:9pt;mso-wrap-distance-top:0;mso-wrap-distance-right:9pt;mso-wrap-distance-bottom:0;mso-position-horizontal:absolute;mso-position-horizontal-relative:text;mso-position-vertical:absolute;mso-position-vertical-relative:text;mso-width-percent:0;mso-height-percent:0;mso-width-relative:margin;mso-height-relative:margin;v-text-anchor:top" o:gfxdata="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" fillcolor="white [3201]" stroked="f" strokeweight=".5pt">
-                <v:textbox>
-                  <w:txbxContent>
-                    <w:p>
-                      <w:pPr>
-                        <w:rPr>
-                          <w:rFonts w:ascii="Gill Sans MT" w:hAnsi="Gill Sans MT"/>
-                          <w:b/>
-                          <w:bCs/>
-                          <w:sz w:val="28"/>
-                          <w:szCs w:val="28"/>
-                        </w:rPr>
-                      </w:pPr>
-                      <w:r>
-                        <w:rPr>
-                          <w:rFonts w:ascii="Gill Sans MT" w:hAnsi="Gill Sans MT"/>
-                          <w:b/>
-                          <w:bCs/>
-                          <w:sz w:val="28"/>
-                          <w:szCs w:val="28"/>
-                        </w:rPr>
-                        <w:t>COURSE INFORMATION</w:t>
-                      </w:r>
-                    </w:p>
-                  </w:txbxContent>
-                </v:textbox>
-              </v:shape>
-            </w:pict>
-          </mc:Fallback>
-        </mc:AlternateContent>
-      </w:r>
-      <w:r>
-        <w:rPr>
-          <w:b/>
-          <w:bCs/>
-          <w:noProof/>
-          <w:color w:val="000000" w:themeColor="text1"/>
-          <w:sz w:val="52"/>
-          <w:szCs w:val="52"/>
-        </w:rPr>
-        <w:drawing>
-          <wp:anchor distT="0" distB="0" distL="114300" distR="114300" simplePos="0" relativeHeight="251608576" behindDoc="0" locked="0" layoutInCell="1" allowOverlap="1" wp14:anchorId="03DE9CF3" wp14:editId="75BEF55E">
-            <wp:simplePos x="0" y="0"/>
-            <wp:positionH relativeFrom="margin">
-              <wp:posOffset>828675</wp:posOffset>
-            </wp:positionH>
-            <wp:positionV relativeFrom="paragraph">
-              <wp:posOffset>2354580</wp:posOffset>
-            </wp:positionV>
-            <wp:extent cx="316865" cy="316865"/>
-            <wp:effectExtent l="0" t="0" r="6985" b="6985"/>
-            <wp:wrapSquare wrapText="bothSides"/>
-            <wp:docPr id="727120208" name="Graphic 6" descr="Postit Notes 3 with solid fill"/>
-            <wp:cNvGraphicFramePr>
-              <a:graphicFrameLocks xmlns:a="http://schemas.openxmlformats.org/drawingml/2006/main" noChangeAspect="1"/>
-            </wp:cNvGraphicFramePr>
-            <a:graphic xmlns:a="http://schemas.openxmlformats.org/drawingml/2006/main">
-              <a:graphicData uri="http://schemas.openxmlformats.org/drawingml/2006/picture">
-                <pic:pic xmlns:pic="http://schemas.openxmlformats.org/drawingml/2006/picture">
-                  <pic:nvPicPr>
-                    <pic:cNvPr id="727120208" name="Graphic 727120208" descr="Postit Notes 3 with solid fill"/>
-                    <pic:cNvPicPr/>
-                  </pic:nvPicPr>
-                  <pic:blipFill>
-                    <a:blip r:embed="rId12">
-                      <a:extLst>
-                        <a:ext uri="{96DAC541-7B7A-43D3-8B79-37D633B846F1}">
-                          <asvg:svgBlip xmlns:asvg="http://schemas.microsoft.com/office/drawing/2016/SVG/main" r:embed="rId13"/>
-                        </a:ext>
-                      </a:extLst>
-                    </a:blip>
-                    <a:stretch>
-                      <a:fillRect/>
-                    </a:stretch>
-                  </pic:blipFill>
-                  <pic:spPr>
-                    <a:xfrm>
-                      <a:off x="0" y="0"/>
-                      <a:ext cx="316865" cy="316865"/>
-                    </a:xfrm>
-                    <a:prstGeom prst="rect">
-                      <a:avLst/>
-                    </a:prstGeom>
-                  </pic:spPr>
-                </pic:pic>
-              </a:graphicData>
-            </a:graphic>
-            <wp14:sizeRelH relativeFrom="margin">
-              <wp14:pctWidth>0</wp14:pctWidth>
-            </wp14:sizeRelH>
-            <wp14:sizeRelV relativeFrom="margin">
-              <wp14:pctHeight>0</wp14:pctHeight>
-            </wp14:sizeRelV>
-          </wp:anchor>
-        </w:drawing>
       </w:r>
       <w:r>
         <w:rPr>
@@ -835,6 +777,15 @@
                               </w:rPr>
                               <w:t xml:space="preserve"> </w:t>
                             </w:r>
+                            <w:r>
+                              <w:rPr>
+                                <w:b/>
+                                <w:bCs/>
+                                <w:sz w:val="28"/>
+                                <w:szCs w:val="28"/>
+                              </w:rPr>
+                              <w:t>08-03-2026</w:t>
+                            </w:r>
                           </w:p>
                         </w:txbxContent>
                       </wps:txbx>
@@ -887,6 +838,15 @@
                           <w:szCs w:val="28"/>
                         </w:rPr>
                         <w:t xml:space="preserve"> </w:t>
+                      </w:r>
+                      <w:r>
+                        <w:rPr>
+                          <w:b/>
+                          <w:bCs/>
+                          <w:sz w:val="28"/>
+                          <w:szCs w:val="28"/>
+                        </w:rPr>
+                        <w:t>08-03-2026</w:t>
                       </w:r>
                     </w:p>
                   </w:txbxContent>
@@ -1104,108 +1064,6 @@
                               </w:rPr>
                               <w:t>:</w:t>
                             </w:r>
-                          </w:p>
-                          <w:p>
-                            <w:pPr>
-                              <w:pStyle w:val="ListParagraph"/>
-                              <w:numPr>
-                                <w:ilvl w:val="0"/>
-                                <w:numId w:val="7"/>
-                              </w:numPr>
-                              <w:spacing w:line="480" w:lineRule="auto"/>
-                              <w:rPr>
-                                <w:rFonts w:ascii="Gill Sans MT" w:hAnsi="Gill Sans MT"/>
-                                <w:b/>
-                                <w:bCs/>
-                              </w:rPr>
-                            </w:pPr>
-                            <w:r>
-                              <w:rPr>
-                                <w:rFonts w:ascii="Gill Sans MT" w:hAnsi="Gill Sans MT"/>
-                                <w:b/>
-                                <w:bCs/>
-                              </w:rPr>
-                              <w:t>ID</w:t>
-                            </w:r>
-                            <w:r>
-                              <w:rPr>
-                                <w:rFonts w:ascii="Gill Sans MT" w:hAnsi="Gill Sans MT"/>
-                                <w:b/>
-                                <w:bCs/>
-                              </w:rPr>
-                              <w:tab/>
-                            </w:r>
-                            <w:r>
-                              <w:rPr>
-                                <w:rFonts w:ascii="Gill Sans MT" w:hAnsi="Gill Sans MT"/>
-                                <w:b/>
-                                <w:bCs/>
-                              </w:rPr>
-                              <w:tab/>
-                            </w:r>
-                            <w:r>
-                              <w:rPr>
-                                <w:rFonts w:ascii="Gill Sans MT" w:hAnsi="Gill Sans MT"/>
-                                <w:b/>
-                                <w:bCs/>
-                              </w:rPr>
-                              <w:tab/>
-                            </w:r>
-                            <w:r>
-                              <w:rPr>
-                                <w:rFonts w:ascii="Gill Sans MT" w:hAnsi="Gill Sans MT"/>
-                                <w:b/>
-                                <w:bCs/>
-                              </w:rPr>
-                              <w:t>:</w:t>
-                            </w:r>
-                          </w:p>
-                          <w:p>
-                            <w:pPr>
-                              <w:pStyle w:val="ListParagraph"/>
-                              <w:numPr>
-                                <w:ilvl w:val="0"/>
-                                <w:numId w:val="7"/>
-                              </w:numPr>
-                              <w:spacing w:line="480" w:lineRule="auto"/>
-                              <w:rPr>
-                                <w:rFonts w:ascii="Gill Sans MT" w:hAnsi="Gill Sans MT"/>
-                                <w:b/>
-                                <w:bCs/>
-                              </w:rPr>
-                            </w:pPr>
-                            <w:r>
-                              <w:rPr>
-                                <w:rFonts w:ascii="Gill Sans MT" w:hAnsi="Gill Sans MT"/>
-                                <w:b/>
-                                <w:bCs/>
-                              </w:rPr>
-                              <w:t>Section</w:t>
-                            </w:r>
-                            <w:r>
-                              <w:rPr>
-                                <w:rFonts w:ascii="Gill Sans MT" w:hAnsi="Gill Sans MT"/>
-                                <w:b/>
-                                <w:bCs/>
-                              </w:rPr>
-                              <w:tab/>
-                            </w:r>
-                            <w:r>
-                              <w:rPr>
-                                <w:rFonts w:ascii="Gill Sans MT" w:hAnsi="Gill Sans MT"/>
-                                <w:b/>
-                                <w:bCs/>
-                              </w:rPr>
-                              <w:tab/>
-                            </w:r>
-                            <w:r>
-                              <w:rPr>
-                                <w:rFonts w:ascii="Gill Sans MT" w:hAnsi="Gill Sans MT"/>
-                                <w:b/>
-                                <w:bCs/>
-                              </w:rPr>
-                              <w:t>:</w:t>
-                            </w:r>
                             <w:r>
                               <w:rPr>
                                 <w:rFonts w:ascii="Gill Sans MT" w:hAnsi="Gill Sans MT"/>
@@ -1235,6 +1093,124 @@
                                 <w:b/>
                                 <w:bCs/>
                               </w:rPr>
+                              <w:t>ID</w:t>
+                            </w:r>
+                            <w:r>
+                              <w:rPr>
+                                <w:rFonts w:ascii="Gill Sans MT" w:hAnsi="Gill Sans MT"/>
+                                <w:b/>
+                                <w:bCs/>
+                              </w:rPr>
+                              <w:tab/>
+                            </w:r>
+                            <w:r>
+                              <w:rPr>
+                                <w:rFonts w:ascii="Gill Sans MT" w:hAnsi="Gill Sans MT"/>
+                                <w:b/>
+                                <w:bCs/>
+                              </w:rPr>
+                              <w:tab/>
+                            </w:r>
+                            <w:r>
+                              <w:rPr>
+                                <w:rFonts w:ascii="Gill Sans MT" w:hAnsi="Gill Sans MT"/>
+                                <w:b/>
+                                <w:bCs/>
+                              </w:rPr>
+                              <w:tab/>
+                            </w:r>
+                            <w:r>
+                              <w:rPr>
+                                <w:rFonts w:ascii="Gill Sans MT" w:hAnsi="Gill Sans MT"/>
+                                <w:b/>
+                                <w:bCs/>
+                              </w:rPr>
+                              <w:t>:</w:t>
+                            </w:r>
+                            <w:r>
+                              <w:rPr>
+                                <w:rFonts w:ascii="Gill Sans MT" w:hAnsi="Gill Sans MT"/>
+                                <w:b/>
+                                <w:bCs/>
+                              </w:rPr>
+                              <w:t xml:space="preserve"> </w:t>
+                            </w:r>
+                          </w:p>
+                          <w:p>
+                            <w:pPr>
+                              <w:pStyle w:val="ListParagraph"/>
+                              <w:numPr>
+                                <w:ilvl w:val="0"/>
+                                <w:numId w:val="7"/>
+                              </w:numPr>
+                              <w:spacing w:line="480" w:lineRule="auto"/>
+                              <w:rPr>
+                                <w:rFonts w:ascii="Gill Sans MT" w:hAnsi="Gill Sans MT"/>
+                                <w:b/>
+                                <w:bCs/>
+                              </w:rPr>
+                            </w:pPr>
+                            <w:r>
+                              <w:rPr>
+                                <w:rFonts w:ascii="Gill Sans MT" w:hAnsi="Gill Sans MT"/>
+                                <w:b/>
+                                <w:bCs/>
+                              </w:rPr>
+                              <w:t>Section</w:t>
+                            </w:r>
+                            <w:r>
+                              <w:rPr>
+                                <w:rFonts w:ascii="Gill Sans MT" w:hAnsi="Gill Sans MT"/>
+                                <w:b/>
+                                <w:bCs/>
+                              </w:rPr>
+                              <w:tab/>
+                            </w:r>
+                            <w:r>
+                              <w:rPr>
+                                <w:rFonts w:ascii="Gill Sans MT" w:hAnsi="Gill Sans MT"/>
+                                <w:b/>
+                                <w:bCs/>
+                              </w:rPr>
+                              <w:tab/>
+                            </w:r>
+                            <w:r>
+                              <w:rPr>
+                                <w:rFonts w:ascii="Gill Sans MT" w:hAnsi="Gill Sans MT"/>
+                                <w:b/>
+                                <w:bCs/>
+                              </w:rPr>
+                              <w:t>:</w:t>
+                            </w:r>
+                            <w:r>
+                              <w:rPr>
+                                <w:rFonts w:ascii="Gill Sans MT" w:hAnsi="Gill Sans MT"/>
+                                <w:b/>
+                                <w:bCs/>
+                              </w:rPr>
+                              <w:t xml:space="preserve"> </w:t>
+                            </w:r>
+                          </w:p>
+                          <w:p>
+                            <w:pPr>
+                              <w:pStyle w:val="ListParagraph"/>
+                              <w:numPr>
+                                <w:ilvl w:val="0"/>
+                                <w:numId w:val="7"/>
+                              </w:numPr>
+                              <w:spacing w:line="480" w:lineRule="auto"/>
+                              <w:rPr>
+                                <w:rFonts w:ascii="Gill Sans MT" w:hAnsi="Gill Sans MT"/>
+                                <w:b/>
+                                <w:bCs/>
+                              </w:rPr>
+                            </w:pPr>
+                            <w:r>
+                              <w:rPr>
+                                <w:rFonts w:ascii="Gill Sans MT" w:hAnsi="Gill Sans MT"/>
+                                <w:b/>
+                                <w:bCs/>
+                              </w:rPr>
                               <w:t>Department</w:t>
                             </w:r>
                             <w:r>
@@ -1260,6 +1236,14 @@
                                 <w:bCs/>
                               </w:rPr>
                               <w:t>:</w:t>
+                            </w:r>
+                            <w:r>
+                              <w:rPr>
+                                <w:rFonts w:ascii="Gill Sans MT" w:hAnsi="Gill Sans MT"/>
+                                <w:b/>
+                                <w:bCs/>
+                              </w:rPr>
+                              <w:t xml:space="preserve"> </w:t>
                             </w:r>
                           </w:p>
                         </w:txbxContent>
@@ -1319,108 +1303,6 @@
                         </w:rPr>
                         <w:t>:</w:t>
                       </w:r>
-                    </w:p>
-                    <w:p>
-                      <w:pPr>
-                        <w:pStyle w:val="ListParagraph"/>
-                        <w:numPr>
-                          <w:ilvl w:val="0"/>
-                          <w:numId w:val="7"/>
-                        </w:numPr>
-                        <w:spacing w:line="480" w:lineRule="auto"/>
-                        <w:rPr>
-                          <w:rFonts w:ascii="Gill Sans MT" w:hAnsi="Gill Sans MT"/>
-                          <w:b/>
-                          <w:bCs/>
-                        </w:rPr>
-                      </w:pPr>
-                      <w:r>
-                        <w:rPr>
-                          <w:rFonts w:ascii="Gill Sans MT" w:hAnsi="Gill Sans MT"/>
-                          <w:b/>
-                          <w:bCs/>
-                        </w:rPr>
-                        <w:t>ID</w:t>
-                      </w:r>
-                      <w:r>
-                        <w:rPr>
-                          <w:rFonts w:ascii="Gill Sans MT" w:hAnsi="Gill Sans MT"/>
-                          <w:b/>
-                          <w:bCs/>
-                        </w:rPr>
-                        <w:tab/>
-                      </w:r>
-                      <w:r>
-                        <w:rPr>
-                          <w:rFonts w:ascii="Gill Sans MT" w:hAnsi="Gill Sans MT"/>
-                          <w:b/>
-                          <w:bCs/>
-                        </w:rPr>
-                        <w:tab/>
-                      </w:r>
-                      <w:r>
-                        <w:rPr>
-                          <w:rFonts w:ascii="Gill Sans MT" w:hAnsi="Gill Sans MT"/>
-                          <w:b/>
-                          <w:bCs/>
-                        </w:rPr>
-                        <w:tab/>
-                      </w:r>
-                      <w:r>
-                        <w:rPr>
-                          <w:rFonts w:ascii="Gill Sans MT" w:hAnsi="Gill Sans MT"/>
-                          <w:b/>
-                          <w:bCs/>
-                        </w:rPr>
-                        <w:t>:</w:t>
-                      </w:r>
-                    </w:p>
-                    <w:p>
-                      <w:pPr>
-                        <w:pStyle w:val="ListParagraph"/>
-                        <w:numPr>
-                          <w:ilvl w:val="0"/>
-                          <w:numId w:val="7"/>
-                        </w:numPr>
-                        <w:spacing w:line="480" w:lineRule="auto"/>
-                        <w:rPr>
-                          <w:rFonts w:ascii="Gill Sans MT" w:hAnsi="Gill Sans MT"/>
-                          <w:b/>
-                          <w:bCs/>
-                        </w:rPr>
-                      </w:pPr>
-                      <w:r>
-                        <w:rPr>
-                          <w:rFonts w:ascii="Gill Sans MT" w:hAnsi="Gill Sans MT"/>
-                          <w:b/>
-                          <w:bCs/>
-                        </w:rPr>
-                        <w:t>Section</w:t>
-                      </w:r>
-                      <w:r>
-                        <w:rPr>
-                          <w:rFonts w:ascii="Gill Sans MT" w:hAnsi="Gill Sans MT"/>
-                          <w:b/>
-                          <w:bCs/>
-                        </w:rPr>
-                        <w:tab/>
-                      </w:r>
-                      <w:r>
-                        <w:rPr>
-                          <w:rFonts w:ascii="Gill Sans MT" w:hAnsi="Gill Sans MT"/>
-                          <w:b/>
-                          <w:bCs/>
-                        </w:rPr>
-                        <w:tab/>
-                      </w:r>
-                      <w:r>
-                        <w:rPr>
-                          <w:rFonts w:ascii="Gill Sans MT" w:hAnsi="Gill Sans MT"/>
-                          <w:b/>
-                          <w:bCs/>
-                        </w:rPr>
-                        <w:t>:</w:t>
-                      </w:r>
                       <w:r>
                         <w:rPr>
                           <w:rFonts w:ascii="Gill Sans MT" w:hAnsi="Gill Sans MT"/>
@@ -1450,6 +1332,124 @@
                           <w:b/>
                           <w:bCs/>
                         </w:rPr>
+                        <w:t>ID</w:t>
+                      </w:r>
+                      <w:r>
+                        <w:rPr>
+                          <w:rFonts w:ascii="Gill Sans MT" w:hAnsi="Gill Sans MT"/>
+                          <w:b/>
+                          <w:bCs/>
+                        </w:rPr>
+                        <w:tab/>
+                      </w:r>
+                      <w:r>
+                        <w:rPr>
+                          <w:rFonts w:ascii="Gill Sans MT" w:hAnsi="Gill Sans MT"/>
+                          <w:b/>
+                          <w:bCs/>
+                        </w:rPr>
+                        <w:tab/>
+                      </w:r>
+                      <w:r>
+                        <w:rPr>
+                          <w:rFonts w:ascii="Gill Sans MT" w:hAnsi="Gill Sans MT"/>
+                          <w:b/>
+                          <w:bCs/>
+                        </w:rPr>
+                        <w:tab/>
+                      </w:r>
+                      <w:r>
+                        <w:rPr>
+                          <w:rFonts w:ascii="Gill Sans MT" w:hAnsi="Gill Sans MT"/>
+                          <w:b/>
+                          <w:bCs/>
+                        </w:rPr>
+                        <w:t>:</w:t>
+                      </w:r>
+                      <w:r>
+                        <w:rPr>
+                          <w:rFonts w:ascii="Gill Sans MT" w:hAnsi="Gill Sans MT"/>
+                          <w:b/>
+                          <w:bCs/>
+                        </w:rPr>
+                        <w:t xml:space="preserve"> </w:t>
+                      </w:r>
+                    </w:p>
+                    <w:p>
+                      <w:pPr>
+                        <w:pStyle w:val="ListParagraph"/>
+                        <w:numPr>
+                          <w:ilvl w:val="0"/>
+                          <w:numId w:val="7"/>
+                        </w:numPr>
+                        <w:spacing w:line="480" w:lineRule="auto"/>
+                        <w:rPr>
+                          <w:rFonts w:ascii="Gill Sans MT" w:hAnsi="Gill Sans MT"/>
+                          <w:b/>
+                          <w:bCs/>
+                        </w:rPr>
+                      </w:pPr>
+                      <w:r>
+                        <w:rPr>
+                          <w:rFonts w:ascii="Gill Sans MT" w:hAnsi="Gill Sans MT"/>
+                          <w:b/>
+                          <w:bCs/>
+                        </w:rPr>
+                        <w:t>Section</w:t>
+                      </w:r>
+                      <w:r>
+                        <w:rPr>
+                          <w:rFonts w:ascii="Gill Sans MT" w:hAnsi="Gill Sans MT"/>
+                          <w:b/>
+                          <w:bCs/>
+                        </w:rPr>
+                        <w:tab/>
+                      </w:r>
+                      <w:r>
+                        <w:rPr>
+                          <w:rFonts w:ascii="Gill Sans MT" w:hAnsi="Gill Sans MT"/>
+                          <w:b/>
+                          <w:bCs/>
+                        </w:rPr>
+                        <w:tab/>
+                      </w:r>
+                      <w:r>
+                        <w:rPr>
+                          <w:rFonts w:ascii="Gill Sans MT" w:hAnsi="Gill Sans MT"/>
+                          <w:b/>
+                          <w:bCs/>
+                        </w:rPr>
+                        <w:t>:</w:t>
+                      </w:r>
+                      <w:r>
+                        <w:rPr>
+                          <w:rFonts w:ascii="Gill Sans MT" w:hAnsi="Gill Sans MT"/>
+                          <w:b/>
+                          <w:bCs/>
+                        </w:rPr>
+                        <w:t xml:space="preserve"> </w:t>
+                      </w:r>
+                    </w:p>
+                    <w:p>
+                      <w:pPr>
+                        <w:pStyle w:val="ListParagraph"/>
+                        <w:numPr>
+                          <w:ilvl w:val="0"/>
+                          <w:numId w:val="7"/>
+                        </w:numPr>
+                        <w:spacing w:line="480" w:lineRule="auto"/>
+                        <w:rPr>
+                          <w:rFonts w:ascii="Gill Sans MT" w:hAnsi="Gill Sans MT"/>
+                          <w:b/>
+                          <w:bCs/>
+                        </w:rPr>
+                      </w:pPr>
+                      <w:r>
+                        <w:rPr>
+                          <w:rFonts w:ascii="Gill Sans MT" w:hAnsi="Gill Sans MT"/>
+                          <w:b/>
+                          <w:bCs/>
+                        </w:rPr>
                         <w:t>Department</w:t>
                       </w:r>
                       <w:r>
@@ -1475,6 +1475,14 @@
                           <w:bCs/>
                         </w:rPr>
                         <w:t>:</w:t>
+                      </w:r>
+                      <w:r>
+                        <w:rPr>
+                          <w:rFonts w:ascii="Gill Sans MT" w:hAnsi="Gill Sans MT"/>
+                          <w:b/>
+                          <w:bCs/>
+                        </w:rPr>
+                        <w:t xml:space="preserve"> </w:t>
                       </w:r>
                     </w:p>
                   </w:txbxContent>
@@ -2005,7 +2013,7 @@
                                 <w:bCs/>
                                 <w:color w:val="0D0D0D" w:themeColor="text1" w:themeTint="F2"/>
                               </w:rPr>
-                              <w:t xml:space="preserve">Nishat </w:t>
+                              <w:t xml:space="preserve">Md. </w:t>
                             </w:r>
                             <w:proofErr w:type="spellStart"/>
                             <w:r>
@@ -2015,7 +2023,7 @@
                                 <w:bCs/>
                                 <w:color w:val="0D0D0D" w:themeColor="text1" w:themeTint="F2"/>
                               </w:rPr>
-                              <w:t>Tasnim</w:t>
+                              <w:t>Ershadul</w:t>
                             </w:r>
                             <w:proofErr w:type="spellEnd"/>
                             <w:r>
@@ -2025,19 +2033,8 @@
                                 <w:bCs/>
                                 <w:color w:val="0D0D0D" w:themeColor="text1" w:themeTint="F2"/>
                               </w:rPr>
-                              <w:t xml:space="preserve"> </w:t>
+                              <w:t xml:space="preserve"> Haque</w:t>
                             </w:r>
-                            <w:proofErr w:type="spellStart"/>
-                            <w:r>
-                              <w:rPr>
-                                <w:rFonts w:ascii="Gill Sans MT" w:hAnsi="Gill Sans MT" w:cs="Aharoni"/>
-                                <w:b/>
-                                <w:bCs/>
-                                <w:color w:val="0D0D0D" w:themeColor="text1" w:themeTint="F2"/>
-                              </w:rPr>
-                              <w:t>Mahin</w:t>
-                            </w:r>
-                            <w:proofErr w:type="spellEnd"/>
                             <w:r>
                               <w:rPr>
                                 <w:rFonts w:ascii="Gill Sans MT" w:hAnsi="Gill Sans MT" w:cs="Aharoni"/>
@@ -2064,7 +2061,34 @@
                                 <w:bCs/>
                                 <w:color w:val="0D0D0D" w:themeColor="text1" w:themeTint="F2"/>
                               </w:rPr>
-                              <w:t>Lecturer, Department of Economics,</w:t>
+                              <w:t>Adjunct Faculty</w:t>
+                            </w:r>
+                            <w:r>
+                              <w:rPr>
+                                <w:rFonts w:ascii="Gill Sans MT" w:hAnsi="Gill Sans MT" w:cs="Aharoni"/>
+                                <w:b/>
+                                <w:bCs/>
+                                <w:color w:val="0D0D0D" w:themeColor="text1" w:themeTint="F2"/>
+                              </w:rPr>
+                              <w:t xml:space="preserve">, Department of </w:t>
+                            </w:r>
+                            <w:r>
+                              <w:rPr>
+                                <w:rFonts w:ascii="Gill Sans MT" w:hAnsi="Gill Sans MT" w:cs="Aharoni"/>
+                                <w:b/>
+                                <w:bCs/>
+                                <w:color w:val="0D0D0D" w:themeColor="text1" w:themeTint="F2"/>
+                              </w:rPr>
+                              <w:t>MPS</w:t>
+                            </w:r>
+                            <w:r>
+                              <w:rPr>
+                                <w:rFonts w:ascii="Gill Sans MT" w:hAnsi="Gill Sans MT" w:cs="Aharoni"/>
+                                <w:b/>
+                                <w:bCs/>
+                                <w:color w:val="0D0D0D" w:themeColor="text1" w:themeTint="F2"/>
+                              </w:rPr>
+                              <w:t>,</w:t>
                             </w:r>
                           </w:p>
                           <w:p>
@@ -2139,7 +2163,7 @@
                           <w:bCs/>
                           <w:color w:val="0D0D0D" w:themeColor="text1" w:themeTint="F2"/>
                         </w:rPr>
-                        <w:t xml:space="preserve">Nishat </w:t>
+                        <w:t xml:space="preserve">Md. </w:t>
                       </w:r>
                       <w:proofErr w:type="spellStart"/>
                       <w:r>
@@ -2149,7 +2173,7 @@
                           <w:bCs/>
                           <w:color w:val="0D0D0D" w:themeColor="text1" w:themeTint="F2"/>
                         </w:rPr>
-                        <w:t>Tasnim</w:t>
+                        <w:t>Ershadul</w:t>
                       </w:r>
                       <w:proofErr w:type="spellEnd"/>
                       <w:r>
@@ -2159,19 +2183,8 @@
                           <w:bCs/>
                           <w:color w:val="0D0D0D" w:themeColor="text1" w:themeTint="F2"/>
                         </w:rPr>
-                        <w:t xml:space="preserve"> </w:t>
+                        <w:t xml:space="preserve"> Haque</w:t>
                       </w:r>
-                      <w:proofErr w:type="spellStart"/>
-                      <w:r>
-                        <w:rPr>
-                          <w:rFonts w:ascii="Gill Sans MT" w:hAnsi="Gill Sans MT" w:cs="Aharoni"/>
-                          <w:b/>
-                          <w:bCs/>
-                          <w:color w:val="0D0D0D" w:themeColor="text1" w:themeTint="F2"/>
-                        </w:rPr>
-                        <w:t>Mahin</w:t>
-                      </w:r>
-                      <w:proofErr w:type="spellEnd"/>
                       <w:r>
                         <w:rPr>
                           <w:rFonts w:ascii="Gill Sans MT" w:hAnsi="Gill Sans MT" w:cs="Aharoni"/>
@@ -2198,7 +2211,34 @@
                           <w:bCs/>
                           <w:color w:val="0D0D0D" w:themeColor="text1" w:themeTint="F2"/>
                         </w:rPr>
-                        <w:t>Lecturer, Department of Economics,</w:t>
+                        <w:t>Adjunct Faculty</w:t>
+                      </w:r>
+                      <w:r>
+                        <w:rPr>
+                          <w:rFonts w:ascii="Gill Sans MT" w:hAnsi="Gill Sans MT" w:cs="Aharoni"/>
+                          <w:b/>
+                          <w:bCs/>
+                          <w:color w:val="0D0D0D" w:themeColor="text1" w:themeTint="F2"/>
+                        </w:rPr>
+                        <w:t xml:space="preserve">, Department of </w:t>
+                      </w:r>
+                      <w:r>
+                        <w:rPr>
+                          <w:rFonts w:ascii="Gill Sans MT" w:hAnsi="Gill Sans MT" w:cs="Aharoni"/>
+                          <w:b/>
+                          <w:bCs/>
+                          <w:color w:val="0D0D0D" w:themeColor="text1" w:themeTint="F2"/>
+                        </w:rPr>
+                        <w:t>MPS</w:t>
+                      </w:r>
+                      <w:r>
+                        <w:rPr>
+                          <w:rFonts w:ascii="Gill Sans MT" w:hAnsi="Gill Sans MT" w:cs="Aharoni"/>
+                          <w:b/>
+                          <w:bCs/>
+                          <w:color w:val="0D0D0D" w:themeColor="text1" w:themeTint="F2"/>
+                        </w:rPr>
+                        <w:t>,</w:t>
                       </w:r>
                     </w:p>
                     <w:p>
@@ -4433,6 +4473,25 @@
     <w:uiPriority w:val="99"/>
     <w:rsid w:val="00F333C1"/>
   </w:style>
+  <w:style w:type="paragraph" w:styleId="TOCHeading">
+    <w:name w:val="TOC Heading"/>
+    <w:basedOn w:val="Heading1"/>
+    <w:next w:val="Normal"/>
+    <w:uiPriority w:val="39"/>
+    <w:unhideWhenUsed/>
+    <w:qFormat/>
+    <w:rsid w:val="00F66462"/>
+    <w:pPr>
+      <w:spacing w:before="240" w:after="0" w:line="259" w:lineRule="auto"/>
+      <w:outlineLvl w:val="9"/>
+    </w:pPr>
+    <w:rPr>
+      <w:kern w:val="0"/>
+      <w:sz w:val="32"/>
+      <w:szCs w:val="32"/>
+      <w14:ligatures w14:val="none"/>
+    </w:rPr>
+  </w:style>
 </w:styles>
 </file>
 

</xml_diff>